<commit_message>
Update Bible study notes and themes for multiple languages for 2026-06-12 release
</commit_message>
<xml_diff>
--- a/eng/docx/004.content.docx
+++ b/eng/docx/004.content.docx
@@ -8059,7 +8059,7 @@
           <w:i/>
           <w:lang w:val="en_US" w:bidi="en_US"/>
         </w:rPr>
-        <w:t>Day of the</w:t>
+        <w:t>day of the</w:t>
       </w:r>
       <w:r>
         <w:rPr>
@@ -8525,7 +8525,7 @@
           <w:i/>
           <w:lang w:val="en_US" w:bidi="en_US"/>
         </w:rPr>
-        <w:t>Day of the</w:t>
+        <w:t>day of the</w:t>
       </w:r>
       <w:r>
         <w:rPr>
@@ -8544,7 +8544,7 @@
         <w:rPr>
           <w:lang w:val="en_US" w:bidi="en_US"/>
         </w:rPr>
-        <w:t xml:space="preserve"> to describe Jesus' return as the judge of the world. That day "</w:t>
+        <w:t xml:space="preserve"> to describe the return of Jesus as the judge of the world. That day "</w:t>
       </w:r>
       <w:r>
         <w:rPr>

</xml_diff>